<commit_message>
feat(playground): sample gains a 36-row multi-page table + a row taller than a page
Two new chapters exercising M5 table pagination: chapter 8 is a 36-row table
that must flow across pages; chapter 9 has a single row whose cell holds 60
paragraphs (taller than one page) followed by a normal row. With the current
whole-table placement these overflow past the page edge — the baseline the
row-level pagination work fixes.

Co-Authored-By: Claude Opus 4.8 (1M context) <noreply@anthropic.com>
</commit_message>
<xml_diff>
--- a/apps/playground/public/sample.docx
+++ b/apps/playground/public/sample.docx
@@ -718,6 +718,1058 @@
           <w:p>
             <w:r>
               <w:t xml:space="preserve">Ô bên phải.</w:t>
+            </w:r>
+          </w:p>
+        </w:tc>
+      </w:tr>
+    </w:tbl>
+    <w:p>
+      <w:pPr>
+        <w:jc w:val="left"/>
+      </w:pPr>
+      <w:r>
+        <w:rPr>
+          <w:b/>
+          <w:sz w:val="28"/>
+        </w:rPr>
+        <w:t xml:space="preserve">8. Bảng dài trải qua nhiều trang</w:t>
+      </w:r>
+    </w:p>
+    <w:p>
+      <w:r>
+        <w:t xml:space="preserve">Bảng dưới đây có 36 hàng — dài hơn một trang, buộc layout engine phải ngắt trang theo từng hàng (M5).</w:t>
+      </w:r>
+    </w:p>
+    <w:tbl>
+      <w:tblGrid>
+        <w:gridCol w:w="2400"/>
+        <w:gridCol w:w="6630"/>
+      </w:tblGrid>
+      <w:tr>
+        <w:tc>
+          <w:tcPr/>
+          <w:p>
+            <w:r>
+              <w:rPr>
+                <w:b/>
+              </w:rPr>
+              <w:t xml:space="preserve">Hàng</w:t>
+            </w:r>
+          </w:p>
+        </w:tc>
+        <w:tc>
+          <w:tcPr/>
+          <w:p>
+            <w:r>
+              <w:rPr>
+                <w:b/>
+              </w:rPr>
+              <w:t xml:space="preserve">Mô tả</w:t>
+            </w:r>
+          </w:p>
+        </w:tc>
+      </w:tr>
+      <w:tr>
+        <w:tc>
+          <w:tcPr/>
+          <w:p>
+            <w:r>
+              <w:t xml:space="preserve">Hàng 1</w:t>
+            </w:r>
+          </w:p>
+        </w:tc>
+        <w:tc>
+          <w:tcPr/>
+          <w:p>
+            <w:r>
+              <w:t xml:space="preserve">Nội dung ô bên phải của hàng 1 — một dòng mô tả đủ dài để chiếm trọn bề ngang cột và đôi khi xuống dòng thứ hai.</w:t>
+            </w:r>
+          </w:p>
+        </w:tc>
+      </w:tr>
+      <w:tr>
+        <w:tc>
+          <w:tcPr/>
+          <w:p>
+            <w:r>
+              <w:t xml:space="preserve">Hàng 2</w:t>
+            </w:r>
+          </w:p>
+        </w:tc>
+        <w:tc>
+          <w:tcPr/>
+          <w:p>
+            <w:r>
+              <w:t xml:space="preserve">Nội dung ô bên phải của hàng 2 — một dòng mô tả đủ dài để chiếm trọn bề ngang cột và đôi khi xuống dòng thứ hai.</w:t>
+            </w:r>
+          </w:p>
+        </w:tc>
+      </w:tr>
+      <w:tr>
+        <w:tc>
+          <w:tcPr/>
+          <w:p>
+            <w:r>
+              <w:t xml:space="preserve">Hàng 3</w:t>
+            </w:r>
+          </w:p>
+        </w:tc>
+        <w:tc>
+          <w:tcPr/>
+          <w:p>
+            <w:r>
+              <w:t xml:space="preserve">Nội dung ô bên phải của hàng 3 — một dòng mô tả đủ dài để chiếm trọn bề ngang cột và đôi khi xuống dòng thứ hai.</w:t>
+            </w:r>
+          </w:p>
+        </w:tc>
+      </w:tr>
+      <w:tr>
+        <w:tc>
+          <w:tcPr/>
+          <w:p>
+            <w:r>
+              <w:t xml:space="preserve">Hàng 4</w:t>
+            </w:r>
+          </w:p>
+        </w:tc>
+        <w:tc>
+          <w:tcPr/>
+          <w:p>
+            <w:r>
+              <w:t xml:space="preserve">Nội dung ô bên phải của hàng 4 — một dòng mô tả đủ dài để chiếm trọn bề ngang cột và đôi khi xuống dòng thứ hai.</w:t>
+            </w:r>
+          </w:p>
+        </w:tc>
+      </w:tr>
+      <w:tr>
+        <w:tc>
+          <w:tcPr/>
+          <w:p>
+            <w:r>
+              <w:t xml:space="preserve">Hàng 5</w:t>
+            </w:r>
+          </w:p>
+        </w:tc>
+        <w:tc>
+          <w:tcPr/>
+          <w:p>
+            <w:r>
+              <w:t xml:space="preserve">Nội dung ô bên phải của hàng 5 — một dòng mô tả đủ dài để chiếm trọn bề ngang cột và đôi khi xuống dòng thứ hai.</w:t>
+            </w:r>
+          </w:p>
+        </w:tc>
+      </w:tr>
+      <w:tr>
+        <w:tc>
+          <w:tcPr/>
+          <w:p>
+            <w:r>
+              <w:t xml:space="preserve">Hàng 6</w:t>
+            </w:r>
+          </w:p>
+        </w:tc>
+        <w:tc>
+          <w:tcPr/>
+          <w:p>
+            <w:r>
+              <w:t xml:space="preserve">Nội dung ô bên phải của hàng 6 — một dòng mô tả đủ dài để chiếm trọn bề ngang cột và đôi khi xuống dòng thứ hai.</w:t>
+            </w:r>
+          </w:p>
+        </w:tc>
+      </w:tr>
+      <w:tr>
+        <w:tc>
+          <w:tcPr/>
+          <w:p>
+            <w:r>
+              <w:t xml:space="preserve">Hàng 7</w:t>
+            </w:r>
+          </w:p>
+        </w:tc>
+        <w:tc>
+          <w:tcPr/>
+          <w:p>
+            <w:r>
+              <w:t xml:space="preserve">Nội dung ô bên phải của hàng 7 — một dòng mô tả đủ dài để chiếm trọn bề ngang cột và đôi khi xuống dòng thứ hai.</w:t>
+            </w:r>
+          </w:p>
+        </w:tc>
+      </w:tr>
+      <w:tr>
+        <w:tc>
+          <w:tcPr/>
+          <w:p>
+            <w:r>
+              <w:t xml:space="preserve">Hàng 8</w:t>
+            </w:r>
+          </w:p>
+        </w:tc>
+        <w:tc>
+          <w:tcPr/>
+          <w:p>
+            <w:r>
+              <w:t xml:space="preserve">Nội dung ô bên phải của hàng 8 — một dòng mô tả đủ dài để chiếm trọn bề ngang cột và đôi khi xuống dòng thứ hai.</w:t>
+            </w:r>
+          </w:p>
+        </w:tc>
+      </w:tr>
+      <w:tr>
+        <w:tc>
+          <w:tcPr/>
+          <w:p>
+            <w:r>
+              <w:t xml:space="preserve">Hàng 9</w:t>
+            </w:r>
+          </w:p>
+        </w:tc>
+        <w:tc>
+          <w:tcPr/>
+          <w:p>
+            <w:r>
+              <w:t xml:space="preserve">Nội dung ô bên phải của hàng 9 — một dòng mô tả đủ dài để chiếm trọn bề ngang cột và đôi khi xuống dòng thứ hai.</w:t>
+            </w:r>
+          </w:p>
+        </w:tc>
+      </w:tr>
+      <w:tr>
+        <w:tc>
+          <w:tcPr/>
+          <w:p>
+            <w:r>
+              <w:t xml:space="preserve">Hàng 10</w:t>
+            </w:r>
+          </w:p>
+        </w:tc>
+        <w:tc>
+          <w:tcPr/>
+          <w:p>
+            <w:r>
+              <w:t xml:space="preserve">Nội dung ô bên phải của hàng 10 — một dòng mô tả đủ dài để chiếm trọn bề ngang cột và đôi khi xuống dòng thứ hai.</w:t>
+            </w:r>
+          </w:p>
+        </w:tc>
+      </w:tr>
+      <w:tr>
+        <w:tc>
+          <w:tcPr/>
+          <w:p>
+            <w:r>
+              <w:t xml:space="preserve">Hàng 11</w:t>
+            </w:r>
+          </w:p>
+        </w:tc>
+        <w:tc>
+          <w:tcPr/>
+          <w:p>
+            <w:r>
+              <w:t xml:space="preserve">Nội dung ô bên phải của hàng 11 — một dòng mô tả đủ dài để chiếm trọn bề ngang cột và đôi khi xuống dòng thứ hai.</w:t>
+            </w:r>
+          </w:p>
+        </w:tc>
+      </w:tr>
+      <w:tr>
+        <w:tc>
+          <w:tcPr/>
+          <w:p>
+            <w:r>
+              <w:t xml:space="preserve">Hàng 12</w:t>
+            </w:r>
+          </w:p>
+        </w:tc>
+        <w:tc>
+          <w:tcPr/>
+          <w:p>
+            <w:r>
+              <w:t xml:space="preserve">Nội dung ô bên phải của hàng 12 — một dòng mô tả đủ dài để chiếm trọn bề ngang cột và đôi khi xuống dòng thứ hai.</w:t>
+            </w:r>
+          </w:p>
+        </w:tc>
+      </w:tr>
+      <w:tr>
+        <w:tc>
+          <w:tcPr/>
+          <w:p>
+            <w:r>
+              <w:t xml:space="preserve">Hàng 13</w:t>
+            </w:r>
+          </w:p>
+        </w:tc>
+        <w:tc>
+          <w:tcPr/>
+          <w:p>
+            <w:r>
+              <w:t xml:space="preserve">Nội dung ô bên phải của hàng 13 — một dòng mô tả đủ dài để chiếm trọn bề ngang cột và đôi khi xuống dòng thứ hai.</w:t>
+            </w:r>
+          </w:p>
+        </w:tc>
+      </w:tr>
+      <w:tr>
+        <w:tc>
+          <w:tcPr/>
+          <w:p>
+            <w:r>
+              <w:t xml:space="preserve">Hàng 14</w:t>
+            </w:r>
+          </w:p>
+        </w:tc>
+        <w:tc>
+          <w:tcPr/>
+          <w:p>
+            <w:r>
+              <w:t xml:space="preserve">Nội dung ô bên phải của hàng 14 — một dòng mô tả đủ dài để chiếm trọn bề ngang cột và đôi khi xuống dòng thứ hai.</w:t>
+            </w:r>
+          </w:p>
+        </w:tc>
+      </w:tr>
+      <w:tr>
+        <w:tc>
+          <w:tcPr/>
+          <w:p>
+            <w:r>
+              <w:t xml:space="preserve">Hàng 15</w:t>
+            </w:r>
+          </w:p>
+        </w:tc>
+        <w:tc>
+          <w:tcPr/>
+          <w:p>
+            <w:r>
+              <w:t xml:space="preserve">Nội dung ô bên phải của hàng 15 — một dòng mô tả đủ dài để chiếm trọn bề ngang cột và đôi khi xuống dòng thứ hai.</w:t>
+            </w:r>
+          </w:p>
+        </w:tc>
+      </w:tr>
+      <w:tr>
+        <w:tc>
+          <w:tcPr/>
+          <w:p>
+            <w:r>
+              <w:t xml:space="preserve">Hàng 16</w:t>
+            </w:r>
+          </w:p>
+        </w:tc>
+        <w:tc>
+          <w:tcPr/>
+          <w:p>
+            <w:r>
+              <w:t xml:space="preserve">Nội dung ô bên phải của hàng 16 — một dòng mô tả đủ dài để chiếm trọn bề ngang cột và đôi khi xuống dòng thứ hai.</w:t>
+            </w:r>
+          </w:p>
+        </w:tc>
+      </w:tr>
+      <w:tr>
+        <w:tc>
+          <w:tcPr/>
+          <w:p>
+            <w:r>
+              <w:t xml:space="preserve">Hàng 17</w:t>
+            </w:r>
+          </w:p>
+        </w:tc>
+        <w:tc>
+          <w:tcPr/>
+          <w:p>
+            <w:r>
+              <w:t xml:space="preserve">Nội dung ô bên phải của hàng 17 — một dòng mô tả đủ dài để chiếm trọn bề ngang cột và đôi khi xuống dòng thứ hai.</w:t>
+            </w:r>
+          </w:p>
+        </w:tc>
+      </w:tr>
+      <w:tr>
+        <w:tc>
+          <w:tcPr/>
+          <w:p>
+            <w:r>
+              <w:t xml:space="preserve">Hàng 18</w:t>
+            </w:r>
+          </w:p>
+        </w:tc>
+        <w:tc>
+          <w:tcPr/>
+          <w:p>
+            <w:r>
+              <w:t xml:space="preserve">Nội dung ô bên phải của hàng 18 — một dòng mô tả đủ dài để chiếm trọn bề ngang cột và đôi khi xuống dòng thứ hai.</w:t>
+            </w:r>
+          </w:p>
+        </w:tc>
+      </w:tr>
+      <w:tr>
+        <w:tc>
+          <w:tcPr/>
+          <w:p>
+            <w:r>
+              <w:t xml:space="preserve">Hàng 19</w:t>
+            </w:r>
+          </w:p>
+        </w:tc>
+        <w:tc>
+          <w:tcPr/>
+          <w:p>
+            <w:r>
+              <w:t xml:space="preserve">Nội dung ô bên phải của hàng 19 — một dòng mô tả đủ dài để chiếm trọn bề ngang cột và đôi khi xuống dòng thứ hai.</w:t>
+            </w:r>
+          </w:p>
+        </w:tc>
+      </w:tr>
+      <w:tr>
+        <w:tc>
+          <w:tcPr/>
+          <w:p>
+            <w:r>
+              <w:t xml:space="preserve">Hàng 20</w:t>
+            </w:r>
+          </w:p>
+        </w:tc>
+        <w:tc>
+          <w:tcPr/>
+          <w:p>
+            <w:r>
+              <w:t xml:space="preserve">Nội dung ô bên phải của hàng 20 — một dòng mô tả đủ dài để chiếm trọn bề ngang cột và đôi khi xuống dòng thứ hai.</w:t>
+            </w:r>
+          </w:p>
+        </w:tc>
+      </w:tr>
+      <w:tr>
+        <w:tc>
+          <w:tcPr/>
+          <w:p>
+            <w:r>
+              <w:t xml:space="preserve">Hàng 21</w:t>
+            </w:r>
+          </w:p>
+        </w:tc>
+        <w:tc>
+          <w:tcPr/>
+          <w:p>
+            <w:r>
+              <w:t xml:space="preserve">Nội dung ô bên phải của hàng 21 — một dòng mô tả đủ dài để chiếm trọn bề ngang cột và đôi khi xuống dòng thứ hai.</w:t>
+            </w:r>
+          </w:p>
+        </w:tc>
+      </w:tr>
+      <w:tr>
+        <w:tc>
+          <w:tcPr/>
+          <w:p>
+            <w:r>
+              <w:t xml:space="preserve">Hàng 22</w:t>
+            </w:r>
+          </w:p>
+        </w:tc>
+        <w:tc>
+          <w:tcPr/>
+          <w:p>
+            <w:r>
+              <w:t xml:space="preserve">Nội dung ô bên phải của hàng 22 — một dòng mô tả đủ dài để chiếm trọn bề ngang cột và đôi khi xuống dòng thứ hai.</w:t>
+            </w:r>
+          </w:p>
+        </w:tc>
+      </w:tr>
+      <w:tr>
+        <w:tc>
+          <w:tcPr/>
+          <w:p>
+            <w:r>
+              <w:t xml:space="preserve">Hàng 23</w:t>
+            </w:r>
+          </w:p>
+        </w:tc>
+        <w:tc>
+          <w:tcPr/>
+          <w:p>
+            <w:r>
+              <w:t xml:space="preserve">Nội dung ô bên phải của hàng 23 — một dòng mô tả đủ dài để chiếm trọn bề ngang cột và đôi khi xuống dòng thứ hai.</w:t>
+            </w:r>
+          </w:p>
+        </w:tc>
+      </w:tr>
+      <w:tr>
+        <w:tc>
+          <w:tcPr/>
+          <w:p>
+            <w:r>
+              <w:t xml:space="preserve">Hàng 24</w:t>
+            </w:r>
+          </w:p>
+        </w:tc>
+        <w:tc>
+          <w:tcPr/>
+          <w:p>
+            <w:r>
+              <w:t xml:space="preserve">Nội dung ô bên phải của hàng 24 — một dòng mô tả đủ dài để chiếm trọn bề ngang cột và đôi khi xuống dòng thứ hai.</w:t>
+            </w:r>
+          </w:p>
+        </w:tc>
+      </w:tr>
+      <w:tr>
+        <w:tc>
+          <w:tcPr/>
+          <w:p>
+            <w:r>
+              <w:t xml:space="preserve">Hàng 25</w:t>
+            </w:r>
+          </w:p>
+        </w:tc>
+        <w:tc>
+          <w:tcPr/>
+          <w:p>
+            <w:r>
+              <w:t xml:space="preserve">Nội dung ô bên phải của hàng 25 — một dòng mô tả đủ dài để chiếm trọn bề ngang cột và đôi khi xuống dòng thứ hai.</w:t>
+            </w:r>
+          </w:p>
+        </w:tc>
+      </w:tr>
+      <w:tr>
+        <w:tc>
+          <w:tcPr/>
+          <w:p>
+            <w:r>
+              <w:t xml:space="preserve">Hàng 26</w:t>
+            </w:r>
+          </w:p>
+        </w:tc>
+        <w:tc>
+          <w:tcPr/>
+          <w:p>
+            <w:r>
+              <w:t xml:space="preserve">Nội dung ô bên phải của hàng 26 — một dòng mô tả đủ dài để chiếm trọn bề ngang cột và đôi khi xuống dòng thứ hai.</w:t>
+            </w:r>
+          </w:p>
+        </w:tc>
+      </w:tr>
+      <w:tr>
+        <w:tc>
+          <w:tcPr/>
+          <w:p>
+            <w:r>
+              <w:t xml:space="preserve">Hàng 27</w:t>
+            </w:r>
+          </w:p>
+        </w:tc>
+        <w:tc>
+          <w:tcPr/>
+          <w:p>
+            <w:r>
+              <w:t xml:space="preserve">Nội dung ô bên phải của hàng 27 — một dòng mô tả đủ dài để chiếm trọn bề ngang cột và đôi khi xuống dòng thứ hai.</w:t>
+            </w:r>
+          </w:p>
+        </w:tc>
+      </w:tr>
+      <w:tr>
+        <w:tc>
+          <w:tcPr/>
+          <w:p>
+            <w:r>
+              <w:t xml:space="preserve">Hàng 28</w:t>
+            </w:r>
+          </w:p>
+        </w:tc>
+        <w:tc>
+          <w:tcPr/>
+          <w:p>
+            <w:r>
+              <w:t xml:space="preserve">Nội dung ô bên phải của hàng 28 — một dòng mô tả đủ dài để chiếm trọn bề ngang cột và đôi khi xuống dòng thứ hai.</w:t>
+            </w:r>
+          </w:p>
+        </w:tc>
+      </w:tr>
+      <w:tr>
+        <w:tc>
+          <w:tcPr/>
+          <w:p>
+            <w:r>
+              <w:t xml:space="preserve">Hàng 29</w:t>
+            </w:r>
+          </w:p>
+        </w:tc>
+        <w:tc>
+          <w:tcPr/>
+          <w:p>
+            <w:r>
+              <w:t xml:space="preserve">Nội dung ô bên phải của hàng 29 — một dòng mô tả đủ dài để chiếm trọn bề ngang cột và đôi khi xuống dòng thứ hai.</w:t>
+            </w:r>
+          </w:p>
+        </w:tc>
+      </w:tr>
+      <w:tr>
+        <w:tc>
+          <w:tcPr/>
+          <w:p>
+            <w:r>
+              <w:t xml:space="preserve">Hàng 30</w:t>
+            </w:r>
+          </w:p>
+        </w:tc>
+        <w:tc>
+          <w:tcPr/>
+          <w:p>
+            <w:r>
+              <w:t xml:space="preserve">Nội dung ô bên phải của hàng 30 — một dòng mô tả đủ dài để chiếm trọn bề ngang cột và đôi khi xuống dòng thứ hai.</w:t>
+            </w:r>
+          </w:p>
+        </w:tc>
+      </w:tr>
+      <w:tr>
+        <w:tc>
+          <w:tcPr/>
+          <w:p>
+            <w:r>
+              <w:t xml:space="preserve">Hàng 31</w:t>
+            </w:r>
+          </w:p>
+        </w:tc>
+        <w:tc>
+          <w:tcPr/>
+          <w:p>
+            <w:r>
+              <w:t xml:space="preserve">Nội dung ô bên phải của hàng 31 — một dòng mô tả đủ dài để chiếm trọn bề ngang cột và đôi khi xuống dòng thứ hai.</w:t>
+            </w:r>
+          </w:p>
+        </w:tc>
+      </w:tr>
+      <w:tr>
+        <w:tc>
+          <w:tcPr/>
+          <w:p>
+            <w:r>
+              <w:t xml:space="preserve">Hàng 32</w:t>
+            </w:r>
+          </w:p>
+        </w:tc>
+        <w:tc>
+          <w:tcPr/>
+          <w:p>
+            <w:r>
+              <w:t xml:space="preserve">Nội dung ô bên phải của hàng 32 — một dòng mô tả đủ dài để chiếm trọn bề ngang cột và đôi khi xuống dòng thứ hai.</w:t>
+            </w:r>
+          </w:p>
+        </w:tc>
+      </w:tr>
+      <w:tr>
+        <w:tc>
+          <w:tcPr/>
+          <w:p>
+            <w:r>
+              <w:t xml:space="preserve">Hàng 33</w:t>
+            </w:r>
+          </w:p>
+        </w:tc>
+        <w:tc>
+          <w:tcPr/>
+          <w:p>
+            <w:r>
+              <w:t xml:space="preserve">Nội dung ô bên phải của hàng 33 — một dòng mô tả đủ dài để chiếm trọn bề ngang cột và đôi khi xuống dòng thứ hai.</w:t>
+            </w:r>
+          </w:p>
+        </w:tc>
+      </w:tr>
+      <w:tr>
+        <w:tc>
+          <w:tcPr/>
+          <w:p>
+            <w:r>
+              <w:t xml:space="preserve">Hàng 34</w:t>
+            </w:r>
+          </w:p>
+        </w:tc>
+        <w:tc>
+          <w:tcPr/>
+          <w:p>
+            <w:r>
+              <w:t xml:space="preserve">Nội dung ô bên phải của hàng 34 — một dòng mô tả đủ dài để chiếm trọn bề ngang cột và đôi khi xuống dòng thứ hai.</w:t>
+            </w:r>
+          </w:p>
+        </w:tc>
+      </w:tr>
+      <w:tr>
+        <w:tc>
+          <w:tcPr/>
+          <w:p>
+            <w:r>
+              <w:t xml:space="preserve">Hàng 35</w:t>
+            </w:r>
+          </w:p>
+        </w:tc>
+        <w:tc>
+          <w:tcPr/>
+          <w:p>
+            <w:r>
+              <w:t xml:space="preserve">Nội dung ô bên phải của hàng 35 — một dòng mô tả đủ dài để chiếm trọn bề ngang cột và đôi khi xuống dòng thứ hai.</w:t>
+            </w:r>
+          </w:p>
+        </w:tc>
+      </w:tr>
+      <w:tr>
+        <w:tc>
+          <w:tcPr/>
+          <w:p>
+            <w:r>
+              <w:t xml:space="preserve">Hàng 36</w:t>
+            </w:r>
+          </w:p>
+        </w:tc>
+        <w:tc>
+          <w:tcPr/>
+          <w:p>
+            <w:r>
+              <w:t xml:space="preserve">Nội dung ô bên phải của hàng 36 — một dòng mô tả đủ dài để chiếm trọn bề ngang cột và đôi khi xuống dòng thứ hai.</w:t>
+            </w:r>
+          </w:p>
+        </w:tc>
+      </w:tr>
+    </w:tbl>
+    <w:p>
+      <w:pPr>
+        <w:jc w:val="left"/>
+      </w:pPr>
+      <w:r>
+        <w:rPr>
+          <w:b/>
+          <w:sz w:val="28"/>
+        </w:rPr>
+        <w:t xml:space="preserve">9. Hàng cao hơn một trang</w:t>
+      </w:r>
+    </w:p>
+    <w:p>
+      <w:r>
+        <w:t xml:space="preserve">Hàng thứ nhất của bảng sau chứa 60 đoạn — cao hơn cả một trang, buộc phải tách giữa hàng.</w:t>
+      </w:r>
+    </w:p>
+    <w:tbl>
+      <w:tblGrid>
+        <w:gridCol w:w="2400"/>
+        <w:gridCol w:w="6630"/>
+      </w:tblGrid>
+      <w:tr>
+        <w:tc>
+          <w:tcPr/>
+          <w:p>
+            <w:r>
+              <w:rPr>
+                <w:b/>
+              </w:rPr>
+              <w:t xml:space="preserve">Nhãn của hàng siêu cao</w:t>
+            </w:r>
+          </w:p>
+        </w:tc>
+        <w:tc>
+          <w:tcPr/>
+          <w:p>
+            <w:r>
+              <w:t xml:space="preserve">Dòng 1 trong ô siêu cao — nội dung lấp đầy để tổng chiều cao của hàng vượt quá một trang.</w:t>
+            </w:r>
+          </w:p>
+          <w:p>
+            <w:r>
+              <w:t xml:space="preserve">Dòng 2 trong ô siêu cao — nội dung lấp đầy để tổng chiều cao của hàng vượt quá một trang.</w:t>
+            </w:r>
+          </w:p>
+          <w:p>
+            <w:r>
+              <w:t xml:space="preserve">Dòng 3 trong ô siêu cao — nội dung lấp đầy để tổng chiều cao của hàng vượt quá một trang.</w:t>
+            </w:r>
+          </w:p>
+          <w:p>
+            <w:r>
+              <w:t xml:space="preserve">Dòng 4 trong ô siêu cao — nội dung lấp đầy để tổng chiều cao của hàng vượt quá một trang.</w:t>
+            </w:r>
+          </w:p>
+          <w:p>
+            <w:r>
+              <w:t xml:space="preserve">Dòng 5 trong ô siêu cao — nội dung lấp đầy để tổng chiều cao của hàng vượt quá một trang.</w:t>
+            </w:r>
+          </w:p>
+          <w:p>
+            <w:r>
+              <w:t xml:space="preserve">Dòng 6 trong ô siêu cao — nội dung lấp đầy để tổng chiều cao của hàng vượt quá một trang.</w:t>
+            </w:r>
+          </w:p>
+          <w:p>
+            <w:r>
+              <w:t xml:space="preserve">Dòng 7 trong ô siêu cao — nội dung lấp đầy để tổng chiều cao của hàng vượt quá một trang.</w:t>
+            </w:r>
+          </w:p>
+          <w:p>
+            <w:r>
+              <w:t xml:space="preserve">Dòng 8 trong ô siêu cao — nội dung lấp đầy để tổng chiều cao của hàng vượt quá một trang.</w:t>
+            </w:r>
+          </w:p>
+          <w:p>
+            <w:r>
+              <w:t xml:space="preserve">Dòng 9 trong ô siêu cao — nội dung lấp đầy để tổng chiều cao của hàng vượt quá một trang.</w:t>
+            </w:r>
+          </w:p>
+          <w:p>
+            <w:r>
+              <w:t xml:space="preserve">Dòng 10 trong ô siêu cao — nội dung lấp đầy để tổng chiều cao của hàng vượt quá một trang.</w:t>
+            </w:r>
+          </w:p>
+          <w:p>
+            <w:r>
+              <w:t xml:space="preserve">Dòng 11 trong ô siêu cao — nội dung lấp đầy để tổng chiều cao của hàng vượt quá một trang.</w:t>
+            </w:r>
+          </w:p>
+          <w:p>
+            <w:r>
+              <w:t xml:space="preserve">Dòng 12 trong ô siêu cao — nội dung lấp đầy để tổng chiều cao của hàng vượt quá một trang.</w:t>
+            </w:r>
+          </w:p>
+          <w:p>
+            <w:r>
+              <w:t xml:space="preserve">Dòng 13 trong ô siêu cao — nội dung lấp đầy để tổng chiều cao của hàng vượt quá một trang.</w:t>
+            </w:r>
+          </w:p>
+          <w:p>
+            <w:r>
+              <w:t xml:space="preserve">Dòng 14 trong ô siêu cao — nội dung lấp đầy để tổng chiều cao của hàng vượt quá một trang.</w:t>
+            </w:r>
+          </w:p>
+          <w:p>
+            <w:r>
+              <w:t xml:space="preserve">Dòng 15 trong ô siêu cao — nội dung lấp đầy để tổng chiều cao của hàng vượt quá một trang.</w:t>
+            </w:r>
+          </w:p>
+          <w:p>
+            <w:r>
+              <w:t xml:space="preserve">Dòng 16 trong ô siêu cao — nội dung lấp đầy để tổng chiều cao của hàng vượt quá một trang.</w:t>
+            </w:r>
+          </w:p>
+          <w:p>
+            <w:r>
+              <w:t xml:space="preserve">Dòng 17 trong ô siêu cao — nội dung lấp đầy để tổng chiều cao của hàng vượt quá một trang.</w:t>
+            </w:r>
+          </w:p>
+          <w:p>
+            <w:r>
+              <w:t xml:space="preserve">Dòng 18 trong ô siêu cao — nội dung lấp đầy để tổng chiều cao của hàng vượt quá một trang.</w:t>
+            </w:r>
+          </w:p>
+          <w:p>
+            <w:r>
+              <w:t xml:space="preserve">Dòng 19 trong ô siêu cao — nội dung lấp đầy để tổng chiều cao của hàng vượt quá một trang.</w:t>
+            </w:r>
+          </w:p>
+          <w:p>
+            <w:r>
+              <w:t xml:space="preserve">Dòng 20 trong ô siêu cao — nội dung lấp đầy để tổng chiều cao của hàng vượt quá một trang.</w:t>
+            </w:r>
+          </w:p>
+          <w:p>
+            <w:r>
+              <w:t xml:space="preserve">Dòng 21 trong ô siêu cao — nội dung lấp đầy để tổng chiều cao của hàng vượt quá một trang.</w:t>
+            </w:r>
+          </w:p>
+          <w:p>
+            <w:r>
+              <w:t xml:space="preserve">Dòng 22 trong ô siêu cao — nội dung lấp đầy để tổng chiều cao của hàng vượt quá một trang.</w:t>
+            </w:r>
+          </w:p>
+          <w:p>
+            <w:r>
+              <w:t xml:space="preserve">Dòng 23 trong ô siêu cao — nội dung lấp đầy để tổng chiều cao của hàng vượt quá một trang.</w:t>
+            </w:r>
+          </w:p>
+          <w:p>
+            <w:r>
+              <w:t xml:space="preserve">Dòng 24 trong ô siêu cao — nội dung lấp đầy để tổng chiều cao của hàng vượt quá một trang.</w:t>
+            </w:r>
+          </w:p>
+          <w:p>
+            <w:r>
+              <w:t xml:space="preserve">Dòng 25 trong ô siêu cao — nội dung lấp đầy để tổng chiều cao của hàng vượt quá một trang.</w:t>
+            </w:r>
+          </w:p>
+          <w:p>
+            <w:r>
+              <w:t xml:space="preserve">Dòng 26 trong ô siêu cao — nội dung lấp đầy để tổng chiều cao của hàng vượt quá một trang.</w:t>
+            </w:r>
+          </w:p>
+          <w:p>
+            <w:r>
+              <w:t xml:space="preserve">Dòng 27 trong ô siêu cao — nội dung lấp đầy để tổng chiều cao của hàng vượt quá một trang.</w:t>
+            </w:r>
+          </w:p>
+          <w:p>
+            <w:r>
+              <w:t xml:space="preserve">Dòng 28 trong ô siêu cao — nội dung lấp đầy để tổng chiều cao của hàng vượt quá một trang.</w:t>
+            </w:r>
+          </w:p>
+          <w:p>
+            <w:r>
+              <w:t xml:space="preserve">Dòng 29 trong ô siêu cao — nội dung lấp đầy để tổng chiều cao của hàng vượt quá một trang.</w:t>
+            </w:r>
+          </w:p>
+          <w:p>
+            <w:r>
+              <w:t xml:space="preserve">Dòng 30 trong ô siêu cao — nội dung lấp đầy để tổng chiều cao của hàng vượt quá một trang.</w:t>
+            </w:r>
+          </w:p>
+          <w:p>
+            <w:r>
+              <w:t xml:space="preserve">Dòng 31 trong ô siêu cao — nội dung lấp đầy để tổng chiều cao của hàng vượt quá một trang.</w:t>
+            </w:r>
+          </w:p>
+          <w:p>
+            <w:r>
+              <w:t xml:space="preserve">Dòng 32 trong ô siêu cao — nội dung lấp đầy để tổng chiều cao của hàng vượt quá một trang.</w:t>
+            </w:r>
+          </w:p>
+          <w:p>
+            <w:r>
+              <w:t xml:space="preserve">Dòng 33 trong ô siêu cao — nội dung lấp đầy để tổng chiều cao của hàng vượt quá một trang.</w:t>
+            </w:r>
+          </w:p>
+          <w:p>
+            <w:r>
+              <w:t xml:space="preserve">Dòng 34 trong ô siêu cao — nội dung lấp đầy để tổng chiều cao của hàng vượt quá một trang.</w:t>
+            </w:r>
+          </w:p>
+          <w:p>
+            <w:r>
+              <w:t xml:space="preserve">Dòng 35 trong ô siêu cao — nội dung lấp đầy để tổng chiều cao của hàng vượt quá một trang.</w:t>
+            </w:r>
+          </w:p>
+          <w:p>
+            <w:r>
+              <w:t xml:space="preserve">Dòng 36 trong ô siêu cao — nội dung lấp đầy để tổng chiều cao của hàng vượt quá một trang.</w:t>
+            </w:r>
+          </w:p>
+          <w:p>
+            <w:r>
+              <w:t xml:space="preserve">Dòng 37 trong ô siêu cao — nội dung lấp đầy để tổng chiều cao của hàng vượt quá một trang.</w:t>
+            </w:r>
+          </w:p>
+          <w:p>
+            <w:r>
+              <w:t xml:space="preserve">Dòng 38 trong ô siêu cao — nội dung lấp đầy để tổng chiều cao của hàng vượt quá một trang.</w:t>
+            </w:r>
+          </w:p>
+          <w:p>
+            <w:r>
+              <w:t xml:space="preserve">Dòng 39 trong ô siêu cao — nội dung lấp đầy để tổng chiều cao của hàng vượt quá một trang.</w:t>
+            </w:r>
+          </w:p>
+          <w:p>
+            <w:r>
+              <w:t xml:space="preserve">Dòng 40 trong ô siêu cao — nội dung lấp đầy để tổng chiều cao của hàng vượt quá một trang.</w:t>
+            </w:r>
+          </w:p>
+          <w:p>
+            <w:r>
+              <w:t xml:space="preserve">Dòng 41 trong ô siêu cao — nội dung lấp đầy để tổng chiều cao của hàng vượt quá một trang.</w:t>
+            </w:r>
+          </w:p>
+          <w:p>
+            <w:r>
+              <w:t xml:space="preserve">Dòng 42 trong ô siêu cao — nội dung lấp đầy để tổng chiều cao của hàng vượt quá một trang.</w:t>
+            </w:r>
+          </w:p>
+          <w:p>
+            <w:r>
+              <w:t xml:space="preserve">Dòng 43 trong ô siêu cao — nội dung lấp đầy để tổng chiều cao của hàng vượt quá một trang.</w:t>
+            </w:r>
+          </w:p>
+          <w:p>
+            <w:r>
+              <w:t xml:space="preserve">Dòng 44 trong ô siêu cao — nội dung lấp đầy để tổng chiều cao của hàng vượt quá một trang.</w:t>
+            </w:r>
+          </w:p>
+          <w:p>
+            <w:r>
+              <w:t xml:space="preserve">Dòng 45 trong ô siêu cao — nội dung lấp đầy để tổng chiều cao của hàng vượt quá một trang.</w:t>
+            </w:r>
+          </w:p>
+          <w:p>
+            <w:r>
+              <w:t xml:space="preserve">Dòng 46 trong ô siêu cao — nội dung lấp đầy để tổng chiều cao của hàng vượt quá một trang.</w:t>
+            </w:r>
+          </w:p>
+          <w:p>
+            <w:r>
+              <w:t xml:space="preserve">Dòng 47 trong ô siêu cao — nội dung lấp đầy để tổng chiều cao của hàng vượt quá một trang.</w:t>
+            </w:r>
+          </w:p>
+          <w:p>
+            <w:r>
+              <w:t xml:space="preserve">Dòng 48 trong ô siêu cao — nội dung lấp đầy để tổng chiều cao của hàng vượt quá một trang.</w:t>
+            </w:r>
+          </w:p>
+          <w:p>
+            <w:r>
+              <w:t xml:space="preserve">Dòng 49 trong ô siêu cao — nội dung lấp đầy để tổng chiều cao của hàng vượt quá một trang.</w:t>
+            </w:r>
+          </w:p>
+          <w:p>
+            <w:r>
+              <w:t xml:space="preserve">Dòng 50 trong ô siêu cao — nội dung lấp đầy để tổng chiều cao của hàng vượt quá một trang.</w:t>
+            </w:r>
+          </w:p>
+          <w:p>
+            <w:r>
+              <w:t xml:space="preserve">Dòng 51 trong ô siêu cao — nội dung lấp đầy để tổng chiều cao của hàng vượt quá một trang.</w:t>
+            </w:r>
+          </w:p>
+          <w:p>
+            <w:r>
+              <w:t xml:space="preserve">Dòng 52 trong ô siêu cao — nội dung lấp đầy để tổng chiều cao của hàng vượt quá một trang.</w:t>
+            </w:r>
+          </w:p>
+          <w:p>
+            <w:r>
+              <w:t xml:space="preserve">Dòng 53 trong ô siêu cao — nội dung lấp đầy để tổng chiều cao của hàng vượt quá một trang.</w:t>
+            </w:r>
+          </w:p>
+          <w:p>
+            <w:r>
+              <w:t xml:space="preserve">Dòng 54 trong ô siêu cao — nội dung lấp đầy để tổng chiều cao của hàng vượt quá một trang.</w:t>
+            </w:r>
+          </w:p>
+          <w:p>
+            <w:r>
+              <w:t xml:space="preserve">Dòng 55 trong ô siêu cao — nội dung lấp đầy để tổng chiều cao của hàng vượt quá một trang.</w:t>
+            </w:r>
+          </w:p>
+          <w:p>
+            <w:r>
+              <w:t xml:space="preserve">Dòng 56 trong ô siêu cao — nội dung lấp đầy để tổng chiều cao của hàng vượt quá một trang.</w:t>
+            </w:r>
+          </w:p>
+          <w:p>
+            <w:r>
+              <w:t xml:space="preserve">Dòng 57 trong ô siêu cao — nội dung lấp đầy để tổng chiều cao của hàng vượt quá một trang.</w:t>
+            </w:r>
+          </w:p>
+          <w:p>
+            <w:r>
+              <w:t xml:space="preserve">Dòng 58 trong ô siêu cao — nội dung lấp đầy để tổng chiều cao của hàng vượt quá một trang.</w:t>
+            </w:r>
+          </w:p>
+          <w:p>
+            <w:r>
+              <w:t xml:space="preserve">Dòng 59 trong ô siêu cao — nội dung lấp đầy để tổng chiều cao của hàng vượt quá một trang.</w:t>
+            </w:r>
+          </w:p>
+          <w:p>
+            <w:r>
+              <w:t xml:space="preserve">Dòng 60 trong ô siêu cao — nội dung lấp đầy để tổng chiều cao của hàng vượt quá một trang.</w:t>
+            </w:r>
+          </w:p>
+        </w:tc>
+      </w:tr>
+      <w:tr>
+        <w:tc>
+          <w:tcPr/>
+          <w:p>
+            <w:r>
+              <w:t xml:space="preserve">Hàng sau</w:t>
+            </w:r>
+          </w:p>
+        </w:tc>
+        <w:tc>
+          <w:tcPr/>
+          <w:p>
+            <w:r>
+              <w:t xml:space="preserve">Hàng bình thường ngay sau hàng siêu cao.</w:t>
             </w:r>
           </w:p>
         </w:tc>

</xml_diff>

<commit_message>
feat(layout-engine,painter-canvas): M5 — Word cell padding + underline/strike
- Cell padding: CELL_PAD_X is now Word's default cell margin (108 twips =
  7.2px left/right; top/bottom stay 0 like Word). Cell content no longer sits
  glued to the borders.
- Underline/strike finally cross the layout boundary: resolveRun reads the
  underline/strike marks, segments carry the flags plus their MEASURED width
  (markers too), and the painter draws the decoration rects from that width —
  honoring the no-measuring-at-paint-time constraint. Decoration metrics:
  thickness 5% em, underline at baseline + 10% em, strike at baseline − 27% em.

Sample chapter 1 gains 'gạch chân' and 'gạch ngang' runs. Verified in the
browser: underline/strike render (including across a wrap), tables breathe.

Tests: layout-engine 31 (2 new), painter 11 (1 new).

Co-Authored-By: Claude Opus 4.8 (1M context) <noreply@anthropic.com>
</commit_message>
<xml_diff>
--- a/apps/playground/public/sample.docx
+++ b/apps/playground/public/sample.docx
@@ -94,6 +94,24 @@
           <w:color w:val="1F6FEB"/>
         </w:rPr>
         <w:t xml:space="preserve">màu xanh</w:t>
+      </w:r>
+      <w:r>
+        <w:t xml:space="preserve">, </w:t>
+      </w:r>
+      <w:r>
+        <w:rPr>
+          <w:u w:val="single"/>
+        </w:rPr>
+        <w:t xml:space="preserve">gạch chân</w:t>
+      </w:r>
+      <w:r>
+        <w:t xml:space="preserve">, </w:t>
+      </w:r>
+      <w:r>
+        <w:rPr>
+          <w:strike/>
+        </w:rPr>
+        <w:t xml:space="preserve">gạch ngang</w:t>
       </w:r>
       <w:r>
         <w:t xml:space="preserve">, </w:t>

</xml_diff>

<commit_message>
chore(playground): demo all Tier 1/2 OOXML elements in sample.docx
Sample generator only sprinkled highlight / shaded-header / borders during
the Tier 1/2 import work; this fills in the rest so every new convert is
visible when loading sample.docx.

Tier 1:
- w:spacing (line 1.5 + before 12pt / after 6pt) — new ch.8 para 1
- w:br soft line break (two lines, one paragraph) — new ch.8 para 2
- w:pageBreakBefore — ch.9 heading forced to top of a fresh page

Tier 2:
- w:vertAlign super/subscript — E=mc^2 and H_2O in ch.1 marks line
- table w:jc center + w:trHeight (0.4in header) + cell w:vAlign
  (center header, bottom gridSpan) + w:tcBorders (nil top/bottom on a
  body cell) — rebuilt ch.3 table
- w:sym (Wingdings F0B7 -> bullet) — new ch.8 para 3

Renumbered the tail chapters (8->9 .. 11->12) to make room for the new
spacing/break/symbol chapter. Regenerated public/sample.docx.

Co-Authored-By: Claude Opus 4.8 (1M context) <noreply@anthropic.com>
</commit_message>
<xml_diff>
--- a/apps/playground/public/sample.docx
+++ b/apps/playground/public/sample.docx
@@ -123,7 +123,25 @@
         <w:t xml:space="preserve">tô vàng</w:t>
       </w:r>
       <w:r>
-        <w:t xml:space="preserve">, </w:t>
+        <w:t xml:space="preserve">, công thức E=mc</w:t>
+      </w:r>
+      <w:r>
+        <w:rPr>
+          <w:vertAlign w:val="superscript"/>
+        </w:rPr>
+        <w:t xml:space="preserve">2</w:t>
+      </w:r>
+      <w:r>
+        <w:t xml:space="preserve"> và H</w:t>
+      </w:r>
+      <w:r>
+        <w:rPr>
+          <w:vertAlign w:val="subscript"/>
+        </w:rPr>
+        <w:t xml:space="preserve">2</w:t>
+      </w:r>
+      <w:r>
+        <w:t xml:space="preserve">O (super/subscript), </w:t>
       </w:r>
       <w:r>
         <w:rPr>
@@ -255,7 +273,7 @@
           <w:b/>
           <w:sz w:val="28"/>
         </w:rPr>
-        <w:t xml:space="preserve">3. Bảng: độ rộng cột, gộp ngang và dọc</w:t>
+        <w:t xml:space="preserve">3. Bảng: căn giữa, gộp ô, nền &amp; viền ô</w:t>
       </w:r>
     </w:p>
     <w:p>
@@ -268,6 +286,7 @@
     </w:p>
     <w:tbl>
       <w:tblPr>
+        <w:jc w:val="center"/>
         <w:tblBorders>
           <w:top w:val="single"/>
           <w:bottom w:val="single"/>
@@ -279,13 +298,17 @@
       </w:tblPr>
       <w:tblGrid>
         <w:gridCol w:w="2400"/>
-        <w:gridCol w:w="3315"/>
-        <w:gridCol w:w="3315"/>
+        <w:gridCol w:w="2800"/>
+        <w:gridCol w:w="2800"/>
       </w:tblGrid>
       <w:tr>
+        <w:trPr>
+          <w:trHeight w:val="600" w:hRule="atLeast"/>
+        </w:trPr>
         <w:tc>
           <w:tcPr>
             <w:shd w:fill="D9E2F3"/>
+            <w:vAlign w:val="center"/>
           </w:tcPr>
           <w:p>
             <w:r>
@@ -299,6 +322,7 @@
         <w:tc>
           <w:tcPr>
             <w:shd w:fill="D9E2F3"/>
+            <w:vAlign w:val="center"/>
           </w:tcPr>
           <w:p>
             <w:r>
@@ -312,6 +336,7 @@
         <w:tc>
           <w:tcPr>
             <w:shd w:fill="D9E2F3"/>
+            <w:vAlign w:val="center"/>
           </w:tcPr>
           <w:p>
             <w:r>
@@ -359,7 +384,12 @@
           <w:p/>
         </w:tc>
         <w:tc>
-          <w:tcPr/>
+          <w:tcPr>
+            <w:tcBorders>
+              <w:top w:val="nil"/>
+              <w:bottom w:val="nil"/>
+            </w:tcBorders>
+          </w:tcPr>
           <w:p>
             <w:r>
               <w:t xml:space="preserve">95</w:t>
@@ -379,13 +409,14 @@
         <w:tc>
           <w:tcPr>
             <w:gridSpan w:val="3"/>
+            <w:vAlign w:val="bottom"/>
           </w:tcPr>
           <w:p>
             <w:r>
               <w:rPr>
                 <w:i/>
               </w:rPr>
-              <w:t xml:space="preserve">Tổng hợp cả nước — ô gộp ngang ba cột</w:t>
+              <w:t xml:space="preserve">Tổng hợp cả nước — ô gộp ngang ba cột, canh dưới</w:t>
             </w:r>
           </w:p>
         </w:tc>
@@ -804,39 +835,7 @@
           <w:b/>
           <w:sz w:val="28"/>
         </w:rPr>
-        <w:t xml:space="preserve">8. Phần đệm cho đủ độ dài</w:t>
-      </w:r>
-    </w:p>
-    <w:p>
-      <w:pPr>
-        <w:jc w:val="both"/>
-      </w:pPr>
-      <w:r>
-        <w:t xml:space="preserve">Lorem ipsum dolor sit amet, consectetur adipiscing elit, sed do eiusmod tempor incididunt ut labore et dolore magna aliqua. Ut enim ad minim veniam, quis nostrud exercitation ullamco laboris nisi ut aliquip ex ea commodo consequat.</w:t>
-      </w:r>
-    </w:p>
-    <w:p>
-      <w:pPr>
-        <w:jc w:val="both"/>
-      </w:pPr>
-      <w:r>
-        <w:t xml:space="preserve">Duis aute irure dolor in reprehenderit in voluptate velit esse cillum dolore eu fugiat nulla pariatur. Excepteur sint occaecat cupidatat non proident, sunt in culpa qui officia deserunt mollit anim id est laborum.</w:t>
-      </w:r>
-    </w:p>
-    <w:p>
-      <w:pPr>
-        <w:jc w:val="both"/>
-      </w:pPr>
-      <w:r>
-        <w:t xml:space="preserve">Sed ut perspiciatis unde omnis iste natus error sit voluptatem accusantium doloremque laudantium, totam rem aperiam, eaque ipsa quae ab illo inventore veritatis et quasi architecto beatae vitae dicta sunt explicabo.</w:t>
-      </w:r>
-    </w:p>
-    <w:p>
-      <w:pPr>
-        <w:jc w:val="both"/>
-      </w:pPr>
-      <w:r>
-        <w:t xml:space="preserve">Nemo enim ipsam voluptatem quia voluptas sit aspernatur aut odit aut fugit, sed quia consequuntur magni dolores eos qui ratione voluptatem sequi nesciunt, neque porro quisquam est qui dolorem ipsum.</w:t>
+        <w:t xml:space="preserve">8. Giãn dòng, ngắt dòng mềm &amp; ký hiệu</w:t>
       </w:r>
     </w:p>
     <w:p>
@@ -849,6 +848,33 @@
     </w:p>
     <w:p>
       <w:pPr>
+        <w:spacing w:before="240" w:after="120" w:line="360" w:lineRule="auto"/>
+      </w:pPr>
+      <w:r>
+        <w:t xml:space="preserve">Đoạn này dùng w:spacing — giãn dòng 1.5, cách đoạn trên 12pt và dưới 6pt nên trông thưa hơn hẳn các đoạn quanh nó. Sed ut perspiciatis unde omnis iste natus error sit voluptatem accusantium doloremque laudantium, totam rem aperiam, eaque ipsa quae ab illo inventore veritatis et quasi architecto beatae vitae dicta sunt explicabo.</w:t>
+      </w:r>
+    </w:p>
+    <w:p>
+      <w:r>
+        <w:t xml:space="preserve">Dòng đầu của đoạn này</w:t>
+      </w:r>
+      <w:r>
+        <w:br/>
+      </w:r>
+      <w:r>
+        <w:t xml:space="preserve">được ngắt dòng mềm (w:br) xuống dòng hai mà vẫn nằm trong cùng một paragraph.</w:t>
+      </w:r>
+    </w:p>
+    <w:p>
+      <w:r>
+        <w:sym w:font="Wingdings" w:char="F0B7"/>
+      </w:r>
+      <w:r>
+        <w:t xml:space="preserve"> Ký hiệu w:sym (Wingdings F0B7 → •) chèn ngay đầu dòng — khác với bullet của danh sách.</w:t>
+      </w:r>
+    </w:p>
+    <w:p>
+      <w:pPr>
         <w:jc w:val="both"/>
       </w:pPr>
       <w:r>
@@ -857,118 +883,7 @@
     </w:p>
     <w:p>
       <w:pPr>
-        <w:jc w:val="both"/>
-      </w:pPr>
-      <w:r>
-        <w:t xml:space="preserve">Lorem ipsum dolor sit amet, consectetur adipiscing elit, sed do eiusmod tempor incididunt ut labore et dolore magna aliqua. Ut enim ad minim veniam, quis nostrud exercitation ullamco laboris nisi ut aliquip ex ea commodo consequat.</w:t>
-      </w:r>
-    </w:p>
-    <w:p>
-      <w:pPr>
-        <w:jc w:val="both"/>
-      </w:pPr>
-      <w:r>
-        <w:t xml:space="preserve">Duis aute irure dolor in reprehenderit in voluptate velit esse cillum dolore eu fugiat nulla pariatur. Excepteur sint occaecat cupidatat non proident, sunt in culpa qui officia deserunt mollit anim id est laborum.</w:t>
-      </w:r>
-    </w:p>
-    <w:p>
-      <w:pPr>
-        <w:jc w:val="both"/>
-      </w:pPr>
-      <w:r>
-        <w:t xml:space="preserve">Sed ut perspiciatis unde omnis iste natus error sit voluptatem accusantium doloremque laudantium, totam rem aperiam, eaque ipsa quae ab illo inventore veritatis et quasi architecto beatae vitae dicta sunt explicabo.</w:t>
-      </w:r>
-    </w:p>
-    <w:p>
-      <w:pPr>
-        <w:jc w:val="both"/>
-      </w:pPr>
-      <w:r>
-        <w:t xml:space="preserve">Nemo enim ipsam voluptatem quia voluptas sit aspernatur aut odit aut fugit, sed quia consequuntur magni dolores eos qui ratione voluptatem sequi nesciunt, neque porro quisquam est qui dolorem ipsum.</w:t>
-      </w:r>
-    </w:p>
-    <w:p>
-      <w:pPr>
-        <w:jc w:val="both"/>
-      </w:pPr>
-      <w:r>
-        <w:t xml:space="preserve">Việt Nam đất nước ta ơi, mênh mông biển lúa đâu trời đẹp hơn. Cánh cò bay lả rập rờn, mây mờ che đỉnh Trường Sơn sớm chiều. Quê hương biết mấy thân yêu, bao nhiêu đời đã chịu nhiều thương đau.</w:t>
-      </w:r>
-    </w:p>
-    <w:p>
-      <w:pPr>
-        <w:jc w:val="both"/>
-      </w:pPr>
-      <w:r>
-        <w:t xml:space="preserve">Gõ tiếng Việt có dấu là bài kiểm tra quan trọng nhất của bapbong: chữ ư, ơ, ă, â, ê, ô cùng các thanh sắc huyền hỏi ngã nặng phải hiển thị đúng trên canvas ở mọi cỡ chữ và kiểu chữ.</w:t>
-      </w:r>
-    </w:p>
-    <w:p>
-      <w:pPr>
-        <w:jc w:val="both"/>
-      </w:pPr>
-      <w:r>
-        <w:t xml:space="preserve">Lorem ipsum dolor sit amet, consectetur adipiscing elit, sed do eiusmod tempor incididunt ut labore et dolore magna aliqua. Ut enim ad minim veniam, quis nostrud exercitation ullamco laboris nisi ut aliquip ex ea commodo consequat.</w:t>
-      </w:r>
-    </w:p>
-    <w:p>
-      <w:pPr>
-        <w:jc w:val="both"/>
-      </w:pPr>
-      <w:r>
-        <w:t xml:space="preserve">Duis aute irure dolor in reprehenderit in voluptate velit esse cillum dolore eu fugiat nulla pariatur. Excepteur sint occaecat cupidatat non proident, sunt in culpa qui officia deserunt mollit anim id est laborum.</w:t>
-      </w:r>
-    </w:p>
-    <w:p>
-      <w:pPr>
-        <w:jc w:val="both"/>
-      </w:pPr>
-      <w:r>
-        <w:t xml:space="preserve">Sed ut perspiciatis unde omnis iste natus error sit voluptatem accusantium doloremque laudantium, totam rem aperiam, eaque ipsa quae ab illo inventore veritatis et quasi architecto beatae vitae dicta sunt explicabo.</w:t>
-      </w:r>
-    </w:p>
-    <w:p>
-      <w:pPr>
-        <w:jc w:val="both"/>
-      </w:pPr>
-      <w:r>
-        <w:t xml:space="preserve">Nemo enim ipsam voluptatem quia voluptas sit aspernatur aut odit aut fugit, sed quia consequuntur magni dolores eos qui ratione voluptatem sequi nesciunt, neque porro quisquam est qui dolorem ipsum.</w:t>
-      </w:r>
-    </w:p>
-    <w:p>
-      <w:pPr>
-        <w:jc w:val="both"/>
-      </w:pPr>
-      <w:r>
-        <w:t xml:space="preserve">Việt Nam đất nước ta ơi, mênh mông biển lúa đâu trời đẹp hơn. Cánh cò bay lả rập rờn, mây mờ che đỉnh Trường Sơn sớm chiều. Quê hương biết mấy thân yêu, bao nhiêu đời đã chịu nhiều thương đau.</w:t>
-      </w:r>
-    </w:p>
-    <w:p>
-      <w:pPr>
-        <w:jc w:val="both"/>
-      </w:pPr>
-      <w:r>
-        <w:t xml:space="preserve">Gõ tiếng Việt có dấu là bài kiểm tra quan trọng nhất của bapbong: chữ ư, ơ, ă, â, ê, ô cùng các thanh sắc huyền hỏi ngã nặng phải hiển thị đúng trên canvas ở mọi cỡ chữ và kiểu chữ.</w:t>
-      </w:r>
-    </w:p>
-    <w:p>
-      <w:pPr>
-        <w:jc w:val="both"/>
-      </w:pPr>
-      <w:r>
-        <w:t xml:space="preserve">Lorem ipsum dolor sit amet, consectetur adipiscing elit, sed do eiusmod tempor incididunt ut labore et dolore magna aliqua. Ut enim ad minim veniam, quis nostrud exercitation ullamco laboris nisi ut aliquip ex ea commodo consequat.</w:t>
-      </w:r>
-    </w:p>
-    <w:p>
-      <w:pPr>
-        <w:jc w:val="both"/>
-      </w:pPr>
-      <w:r>
-        <w:t xml:space="preserve">Duis aute irure dolor in reprehenderit in voluptate velit esse cillum dolore eu fugiat nulla pariatur. Excepteur sint occaecat cupidatat non proident, sunt in culpa qui officia deserunt mollit anim id est laborum.</w:t>
-      </w:r>
-    </w:p>
-    <w:p>
-      <w:pPr>
+        <w:pageBreakBefore/>
         <w:jc w:val="left"/>
       </w:pPr>
       <w:r>
@@ -976,7 +891,179 @@
           <w:b/>
           <w:sz w:val="28"/>
         </w:rPr>
-        <w:t xml:space="preserve">9. Bảng thứ hai ở cuối tài liệu</w:t>
+        <w:t xml:space="preserve">9. Phần đệm — bắt đầu trang mới (w:pageBreakBefore)</w:t>
+      </w:r>
+    </w:p>
+    <w:p>
+      <w:pPr>
+        <w:jc w:val="both"/>
+      </w:pPr>
+      <w:r>
+        <w:t xml:space="preserve">Lorem ipsum dolor sit amet, consectetur adipiscing elit, sed do eiusmod tempor incididunt ut labore et dolore magna aliqua. Ut enim ad minim veniam, quis nostrud exercitation ullamco laboris nisi ut aliquip ex ea commodo consequat.</w:t>
+      </w:r>
+    </w:p>
+    <w:p>
+      <w:pPr>
+        <w:jc w:val="both"/>
+      </w:pPr>
+      <w:r>
+        <w:t xml:space="preserve">Duis aute irure dolor in reprehenderit in voluptate velit esse cillum dolore eu fugiat nulla pariatur. Excepteur sint occaecat cupidatat non proident, sunt in culpa qui officia deserunt mollit anim id est laborum.</w:t>
+      </w:r>
+    </w:p>
+    <w:p>
+      <w:pPr>
+        <w:jc w:val="both"/>
+      </w:pPr>
+      <w:r>
+        <w:t xml:space="preserve">Sed ut perspiciatis unde omnis iste natus error sit voluptatem accusantium doloremque laudantium, totam rem aperiam, eaque ipsa quae ab illo inventore veritatis et quasi architecto beatae vitae dicta sunt explicabo.</w:t>
+      </w:r>
+    </w:p>
+    <w:p>
+      <w:pPr>
+        <w:jc w:val="both"/>
+      </w:pPr>
+      <w:r>
+        <w:t xml:space="preserve">Nemo enim ipsam voluptatem quia voluptas sit aspernatur aut odit aut fugit, sed quia consequuntur magni dolores eos qui ratione voluptatem sequi nesciunt, neque porro quisquam est qui dolorem ipsum.</w:t>
+      </w:r>
+    </w:p>
+    <w:p>
+      <w:pPr>
+        <w:jc w:val="both"/>
+      </w:pPr>
+      <w:r>
+        <w:t xml:space="preserve">Việt Nam đất nước ta ơi, mênh mông biển lúa đâu trời đẹp hơn. Cánh cò bay lả rập rờn, mây mờ che đỉnh Trường Sơn sớm chiều. Quê hương biết mấy thân yêu, bao nhiêu đời đã chịu nhiều thương đau.</w:t>
+      </w:r>
+    </w:p>
+    <w:p>
+      <w:pPr>
+        <w:jc w:val="both"/>
+      </w:pPr>
+      <w:r>
+        <w:t xml:space="preserve">Gõ tiếng Việt có dấu là bài kiểm tra quan trọng nhất của bapbong: chữ ư, ơ, ă, â, ê, ô cùng các thanh sắc huyền hỏi ngã nặng phải hiển thị đúng trên canvas ở mọi cỡ chữ và kiểu chữ.</w:t>
+      </w:r>
+    </w:p>
+    <w:p>
+      <w:pPr>
+        <w:jc w:val="both"/>
+      </w:pPr>
+      <w:r>
+        <w:t xml:space="preserve">Lorem ipsum dolor sit amet, consectetur adipiscing elit, sed do eiusmod tempor incididunt ut labore et dolore magna aliqua. Ut enim ad minim veniam, quis nostrud exercitation ullamco laboris nisi ut aliquip ex ea commodo consequat.</w:t>
+      </w:r>
+    </w:p>
+    <w:p>
+      <w:pPr>
+        <w:jc w:val="both"/>
+      </w:pPr>
+      <w:r>
+        <w:t xml:space="preserve">Duis aute irure dolor in reprehenderit in voluptate velit esse cillum dolore eu fugiat nulla pariatur. Excepteur sint occaecat cupidatat non proident, sunt in culpa qui officia deserunt mollit anim id est laborum.</w:t>
+      </w:r>
+    </w:p>
+    <w:p>
+      <w:pPr>
+        <w:jc w:val="both"/>
+      </w:pPr>
+      <w:r>
+        <w:t xml:space="preserve">Sed ut perspiciatis unde omnis iste natus error sit voluptatem accusantium doloremque laudantium, totam rem aperiam, eaque ipsa quae ab illo inventore veritatis et quasi architecto beatae vitae dicta sunt explicabo.</w:t>
+      </w:r>
+    </w:p>
+    <w:p>
+      <w:pPr>
+        <w:jc w:val="both"/>
+      </w:pPr>
+      <w:r>
+        <w:t xml:space="preserve">Nemo enim ipsam voluptatem quia voluptas sit aspernatur aut odit aut fugit, sed quia consequuntur magni dolores eos qui ratione voluptatem sequi nesciunt, neque porro quisquam est qui dolorem ipsum.</w:t>
+      </w:r>
+    </w:p>
+    <w:p>
+      <w:pPr>
+        <w:jc w:val="both"/>
+      </w:pPr>
+      <w:r>
+        <w:t xml:space="preserve">Việt Nam đất nước ta ơi, mênh mông biển lúa đâu trời đẹp hơn. Cánh cò bay lả rập rờn, mây mờ che đỉnh Trường Sơn sớm chiều. Quê hương biết mấy thân yêu, bao nhiêu đời đã chịu nhiều thương đau.</w:t>
+      </w:r>
+    </w:p>
+    <w:p>
+      <w:pPr>
+        <w:jc w:val="both"/>
+      </w:pPr>
+      <w:r>
+        <w:t xml:space="preserve">Gõ tiếng Việt có dấu là bài kiểm tra quan trọng nhất của bapbong: chữ ư, ơ, ă, â, ê, ô cùng các thanh sắc huyền hỏi ngã nặng phải hiển thị đúng trên canvas ở mọi cỡ chữ và kiểu chữ.</w:t>
+      </w:r>
+    </w:p>
+    <w:p>
+      <w:pPr>
+        <w:jc w:val="both"/>
+      </w:pPr>
+      <w:r>
+        <w:t xml:space="preserve">Lorem ipsum dolor sit amet, consectetur adipiscing elit, sed do eiusmod tempor incididunt ut labore et dolore magna aliqua. Ut enim ad minim veniam, quis nostrud exercitation ullamco laboris nisi ut aliquip ex ea commodo consequat.</w:t>
+      </w:r>
+    </w:p>
+    <w:p>
+      <w:pPr>
+        <w:jc w:val="both"/>
+      </w:pPr>
+      <w:r>
+        <w:t xml:space="preserve">Duis aute irure dolor in reprehenderit in voluptate velit esse cillum dolore eu fugiat nulla pariatur. Excepteur sint occaecat cupidatat non proident, sunt in culpa qui officia deserunt mollit anim id est laborum.</w:t>
+      </w:r>
+    </w:p>
+    <w:p>
+      <w:pPr>
+        <w:jc w:val="both"/>
+      </w:pPr>
+      <w:r>
+        <w:t xml:space="preserve">Sed ut perspiciatis unde omnis iste natus error sit voluptatem accusantium doloremque laudantium, totam rem aperiam, eaque ipsa quae ab illo inventore veritatis et quasi architecto beatae vitae dicta sunt explicabo.</w:t>
+      </w:r>
+    </w:p>
+    <w:p>
+      <w:pPr>
+        <w:jc w:val="both"/>
+      </w:pPr>
+      <w:r>
+        <w:t xml:space="preserve">Nemo enim ipsam voluptatem quia voluptas sit aspernatur aut odit aut fugit, sed quia consequuntur magni dolores eos qui ratione voluptatem sequi nesciunt, neque porro quisquam est qui dolorem ipsum.</w:t>
+      </w:r>
+    </w:p>
+    <w:p>
+      <w:pPr>
+        <w:jc w:val="both"/>
+      </w:pPr>
+      <w:r>
+        <w:t xml:space="preserve">Việt Nam đất nước ta ơi, mênh mông biển lúa đâu trời đẹp hơn. Cánh cò bay lả rập rờn, mây mờ che đỉnh Trường Sơn sớm chiều. Quê hương biết mấy thân yêu, bao nhiêu đời đã chịu nhiều thương đau.</w:t>
+      </w:r>
+    </w:p>
+    <w:p>
+      <w:pPr>
+        <w:jc w:val="both"/>
+      </w:pPr>
+      <w:r>
+        <w:t xml:space="preserve">Gõ tiếng Việt có dấu là bài kiểm tra quan trọng nhất của bapbong: chữ ư, ơ, ă, â, ê, ô cùng các thanh sắc huyền hỏi ngã nặng phải hiển thị đúng trên canvas ở mọi cỡ chữ và kiểu chữ.</w:t>
+      </w:r>
+    </w:p>
+    <w:p>
+      <w:pPr>
+        <w:jc w:val="both"/>
+      </w:pPr>
+      <w:r>
+        <w:t xml:space="preserve">Lorem ipsum dolor sit amet, consectetur adipiscing elit, sed do eiusmod tempor incididunt ut labore et dolore magna aliqua. Ut enim ad minim veniam, quis nostrud exercitation ullamco laboris nisi ut aliquip ex ea commodo consequat.</w:t>
+      </w:r>
+    </w:p>
+    <w:p>
+      <w:pPr>
+        <w:jc w:val="both"/>
+      </w:pPr>
+      <w:r>
+        <w:t xml:space="preserve">Duis aute irure dolor in reprehenderit in voluptate velit esse cillum dolore eu fugiat nulla pariatur. Excepteur sint occaecat cupidatat non proident, sunt in culpa qui officia deserunt mollit anim id est laborum.</w:t>
+      </w:r>
+    </w:p>
+    <w:p>
+      <w:pPr>
+        <w:jc w:val="left"/>
+      </w:pPr>
+      <w:r>
+        <w:rPr>
+          <w:b/>
+          <w:sz w:val="28"/>
+        </w:rPr>
+        <w:t xml:space="preserve">10. Bảng thứ hai ở cuối tài liệu</w:t>
       </w:r>
     </w:p>
     <w:tbl>
@@ -1036,7 +1123,7 @@
           <w:b/>
           <w:sz w:val="28"/>
         </w:rPr>
-        <w:t xml:space="preserve">10. Bảng dài trải qua nhiều trang</w:t>
+        <w:t xml:space="preserve">11. Bảng dài trải qua nhiều trang</w:t>
       </w:r>
     </w:p>
     <w:p>
@@ -1734,7 +1821,7 @@
           <w:b/>
           <w:sz w:val="28"/>
         </w:rPr>
-        <w:t xml:space="preserve">11. Hàng cao hơn một trang</w:t>
+        <w:t xml:space="preserve">12. Hàng cao hơn một trang</w:t>
       </w:r>
     </w:p>
     <w:p>

</xml_diff>

<commit_message>
test(playground): sample.docx with clustered comments
Add three comments (đậm nghiêng / màu xanh / gạch chân) in the same paragraph
as the existing "màu đỏ" one, so their anchors cluster on nearby lines — a
ready-made case for exercising the comment collision-avoidance and active-snap
behaviour without seeding comments by hand. id 1 stays far away (multi-column
section) as the non-colliding control. Regenerated sample.docx.
</commit_message>
<xml_diff>
--- a/apps/playground/public/sample.docx
+++ b/apps/playground/public/sample.docx
@@ -70,6 +70,7 @@
       <w:r>
         <w:t xml:space="preserve">, </w:t>
       </w:r>
+      <w:commentRangeStart w:id="2"/>
       <w:r>
         <w:rPr>
           <w:b/>
@@ -77,6 +78,10 @@
         </w:rPr>
         <w:t xml:space="preserve">đậm nghiêng</w:t>
       </w:r>
+      <w:commentRangeEnd w:id="2"/>
+      <w:r>
+        <w:commentReference w:id="2"/>
+      </w:r>
       <w:r>
         <w:t xml:space="preserve">, </w:t>
       </w:r>
@@ -94,20 +99,30 @@
       <w:r>
         <w:t xml:space="preserve">, </w:t>
       </w:r>
+      <w:commentRangeStart w:id="3"/>
       <w:r>
         <w:rPr>
           <w:color w:val="1F6FEB"/>
         </w:rPr>
         <w:t xml:space="preserve">màu xanh</w:t>
       </w:r>
+      <w:commentRangeEnd w:id="3"/>
+      <w:r>
+        <w:commentReference w:id="3"/>
+      </w:r>
       <w:r>
         <w:t xml:space="preserve">, </w:t>
       </w:r>
+      <w:commentRangeStart w:id="4"/>
       <w:r>
         <w:rPr>
           <w:u w:val="single"/>
         </w:rPr>
         <w:t xml:space="preserve">gạch chân</w:t>
+      </w:r>
+      <w:commentRangeEnd w:id="4"/>
+      <w:r>
+        <w:commentReference w:id="4"/>
       </w:r>
       <w:r>
         <w:t xml:space="preserve">, </w:t>
@@ -2347,6 +2362,27 @@
     <w:p>
       <w:r>
         <w:t>Comment vắt qua nhiều run trong phần bố cục nhiều cột.</w:t>
+      </w:r>
+    </w:p>
+  </w:comment>
+  <w:comment w:id="2" w:author="Minh Lê" w:date="2026-06-17T09:05:00Z" w:initials="ML">
+    <w:p>
+      <w:r>
+        <w:t>Comment trên "đậm nghiêng" — neo sát các comment kế bên để test chống đè.</w:t>
+      </w:r>
+    </w:p>
+  </w:comment>
+  <w:comment w:id="3" w:author="Reviewer" w:date="2026-06-17T09:10:00Z" w:initials="RV">
+    <w:p>
+      <w:r>
+        <w:t>Comment trên "màu xanh" cùng dòng.</w:t>
+      </w:r>
+    </w:p>
+  </w:comment>
+  <w:comment w:id="4" w:author="Phương Minh" w:date="2026-06-17T09:15:00Z" w:initials="PM">
+    <w:p>
+      <w:r>
+        <w:t>Comment trên "gạch chân" — cụm này dùng để kiểm tra active-snap khi chọn từng card/bong bóng.</w:t>
       </w:r>
     </w:p>
   </w:comment>

</xml_diff>

<commit_message>
feat(docx): import threaded + resolved comments (commentsExtended.xml)
OOXML core comments are flat; Word 2013+ stores threading/resolved in
word/commentsExtended.xml (w15). The importer now reads it: each comment's
w14:paraId is mapped to its id, and commentEx links replies via paraIdParent
(→ parentId) and carries w15:done (→ resolved). Replies have no body range,
so any comment whose thread root is referenced in the body is included.

Sample regenerated with a real reply (id 5 → id 0) and a resolved comment
(id 2). Adds a docx unit test for threaded import.
</commit_message>
<xml_diff>
--- a/apps/playground/public/sample.docx
+++ b/apps/playground/public/sample.docx
@@ -2350,7 +2350,7 @@
 </file>
 
 <file path=word/comments.xml><?xml version="1.0" encoding="utf-8"?>
-<w:comments xmlns:w="http://schemas.openxmlformats.org/wordprocessingml/2006/main">
+<w:comments xmlns:w="http://schemas.openxmlformats.org/wordprocessingml/2006/main" xmlns:w14="http://schemas.microsoft.com/office/word/2010/wordml">
   <w:comment w:id="0" w:author="Phương Minh" w:date="2026-06-17T09:00:00Z" w:initials="PM">
     <w:p>
       <w:r>
@@ -2368,7 +2368,7 @@
   <w:comment w:id="2" w:author="Minh Lê" w:date="2026-06-17T09:05:00Z" w:initials="ML">
     <w:p>
       <w:r>
-        <w:t>Comment trên "đậm nghiêng" — neo sát các comment kế bên để test chống đè.</w:t>
+        <w:t>Comment trên "đậm nghiêng" — đã giải quyết (resolved) để test w15:done.</w:t>
       </w:r>
     </w:p>
   </w:comment>
@@ -2386,7 +2386,25 @@
       </w:r>
     </w:p>
   </w:comment>
+  <w:comment w:id="5" w:author="Reviewer" w:date="2026-06-17T09:20:00Z" w:initials="RV">
+    <w:p>
+      <w:r>
+        <w:t>Reply (thread thật từ commentsExtended) cho comment "màu đỏ".</w:t>
+      </w:r>
+    </w:p>
+  </w:comment>
 </w:comments>
+</file>
+
+<file path=word/commentsExtended.xml><?xml version="1.0" encoding="utf-8"?>
+<w15:commentsEx xmlns:w15="http://schemas.microsoft.com/office/word/2012/wordml">
+  <w15:commentEx w15:paraId="0A000000" w15:done="0"/>
+  <w15:commentEx w15:paraId="0A000001" w15:done="0"/>
+  <w15:commentEx w15:paraId="0A000002" w15:done="1"/>
+  <w15:commentEx w15:paraId="0A000003" w15:done="0"/>
+  <w15:commentEx w15:paraId="0A000004" w15:done="0"/>
+  <w15:commentEx w15:paraId="0A000005" w15:paraIdParent="0A000000" w15:done="0"/>
+</w15:commentsEx>
 </file>
 
 <file path=word/footer1.xml><?xml version="1.0" encoding="utf-8"?>

</xml_diff>